<commit_message>
GOST formatting rewrite: docx_generator, schemas, extraction prompt
- docx_generator.py: full GOST rewrite — TNR 14pt, 1.5x spacing, margins
  (L30/R10/T20/B20mm), tab-stop formula numbering, TOC field, Cyrillic font
  fix (w:eastAsia + w:cs), table cell style, 8-section document structure
- schemas.py: add CalculationSpec.intro_text, CalculationSpec.references,
  Section.level (1=heading1, 2=heading2)
- extraction_system_prompt.txt: rules 11-16 for description/explanation
  wording, section title numbering, level detection, intro_text/references
- test_generate.py: add intro_text + references to spec, explicit level on
  sections, fix results['l_pipe'] → spec.input_data[4].value; regenerate
  test_output (PDF 144 KB)

Co-Authored-By: Claude Sonnet 4.6 <noreply@anthropic.com>
</commit_message>
<xml_diff>
--- a/test_output/test_report.docx
+++ b/test_output/test_report.docx
@@ -85,6 +85,61 @@
         <w:pStyle w:val="Heading1"/>
       </w:pPr>
       <w:r>
+        <w:t>Содержание</w:t>
+      </w:r>
+    </w:p>
+    <w:p>
+      <w:r>
+        <w:fldChar w:fldCharType="begin"/>
+        <w:instrText xml:space="preserve"> TOC \o "1-2" \h \z \u </w:instrText>
+        <w:fldChar w:fldCharType="separate"/>
+        <w:fldChar w:fldCharType="end"/>
+      </w:r>
+    </w:p>
+    <w:p>
+      <w:pPr>
+        <w:ind w:firstLine="0"/>
+      </w:pPr>
+      <w:r>
+        <w:rPr>
+          <w:i/>
+        </w:rPr>
+        <w:t>[Откройте в Word и нажмите Ctrl+A → F9 для обновления содержания]</w:t>
+      </w:r>
+    </w:p>
+    <w:p>
+      <w:r>
+        <w:br w:type="page"/>
+      </w:r>
+    </w:p>
+    <w:p>
+      <w:pPr>
+        <w:pStyle w:val="Heading1"/>
+      </w:pPr>
+      <w:r>
+        <w:t>Введение</w:t>
+      </w:r>
+    </w:p>
+    <w:p>
+      <w:r>
+        <w:t>Целью данной курсовой работы является проектирование системы водоснабжения малого посёлка с определением расчётных расходов воды и гидравлическим расчётом трубопровода.</w:t>
+      </w:r>
+    </w:p>
+    <w:p>
+      <w:r>
+        <w:t>В процессе работы определяются среднесуточные, среднечасовые и максимальные расходы воды, подбирается диаметр трубопровода из условия обеспечения экономической скорости, а также рассчитывается требуемый напор насосной станции.</w:t>
+      </w:r>
+    </w:p>
+    <w:p>
+      <w:r>
+        <w:br w:type="page"/>
+      </w:r>
+    </w:p>
+    <w:p>
+      <w:pPr>
+        <w:pStyle w:val="Heading1"/>
+      </w:pPr>
+      <w:r>
         <w:t>Исходные данные</w:t>
       </w:r>
     </w:p>
@@ -95,48 +150,88 @@
         <w:tblLook w:firstColumn="1" w:firstRow="1" w:lastColumn="0" w:lastRow="0" w:noHBand="0" w:noVBand="1" w:val="04A0"/>
       </w:tblPr>
       <w:tblGrid>
-        <w:gridCol w:w="2160"/>
-        <w:gridCol w:w="2160"/>
-        <w:gridCol w:w="2160"/>
-        <w:gridCol w:w="2160"/>
+        <w:gridCol w:w="2493"/>
+        <w:gridCol w:w="2493"/>
+        <w:gridCol w:w="2493"/>
+        <w:gridCol w:w="2493"/>
       </w:tblGrid>
       <w:tr>
         <w:tc>
           <w:tcPr>
-            <w:tcW w:type="dxa" w:w="2160"/>
+            <w:tcW w:type="dxa" w:w="2493"/>
           </w:tcPr>
           <w:p>
+            <w:pPr>
+              <w:spacing w:before="160" w:after="160"/>
+              <w:ind w:firstLine="0"/>
+              <w:jc w:val="center"/>
+            </w:pPr>
             <w:r>
+              <w:rPr>
+                <w:rFonts w:ascii="Times New Roman" w:hAnsi="Times New Roman"/>
+                <w:b/>
+                <w:sz w:val="24"/>
+              </w:rPr>
               <w:t>Обозначение</w:t>
             </w:r>
           </w:p>
         </w:tc>
         <w:tc>
           <w:tcPr>
-            <w:tcW w:type="dxa" w:w="2160"/>
+            <w:tcW w:type="dxa" w:w="2493"/>
           </w:tcPr>
           <w:p>
+            <w:pPr>
+              <w:spacing w:before="160" w:after="160"/>
+              <w:ind w:firstLine="0"/>
+              <w:jc w:val="center"/>
+            </w:pPr>
             <w:r>
+              <w:rPr>
+                <w:rFonts w:ascii="Times New Roman" w:hAnsi="Times New Roman"/>
+                <w:b/>
+                <w:sz w:val="24"/>
+              </w:rPr>
               <w:t>Наименование</w:t>
             </w:r>
           </w:p>
         </w:tc>
         <w:tc>
           <w:tcPr>
-            <w:tcW w:type="dxa" w:w="2160"/>
+            <w:tcW w:type="dxa" w:w="2493"/>
           </w:tcPr>
           <w:p>
+            <w:pPr>
+              <w:spacing w:before="160" w:after="160"/>
+              <w:ind w:firstLine="0"/>
+              <w:jc w:val="center"/>
+            </w:pPr>
             <w:r>
+              <w:rPr>
+                <w:rFonts w:ascii="Times New Roman" w:hAnsi="Times New Roman"/>
+                <w:b/>
+                <w:sz w:val="24"/>
+              </w:rPr>
               <w:t>Значение</w:t>
             </w:r>
           </w:p>
         </w:tc>
         <w:tc>
           <w:tcPr>
-            <w:tcW w:type="dxa" w:w="2160"/>
+            <w:tcW w:type="dxa" w:w="2493"/>
           </w:tcPr>
           <w:p>
+            <w:pPr>
+              <w:spacing w:before="160" w:after="160"/>
+              <w:ind w:firstLine="0"/>
+              <w:jc w:val="center"/>
+            </w:pPr>
             <w:r>
+              <w:rPr>
+                <w:rFonts w:ascii="Times New Roman" w:hAnsi="Times New Roman"/>
+                <w:b/>
+                <w:sz w:val="24"/>
+              </w:rPr>
               <w:t>Ед. изм.</w:t>
             </w:r>
           </w:p>
@@ -145,40 +240,76 @@
       <w:tr>
         <w:tc>
           <w:tcPr>
-            <w:tcW w:type="dxa" w:w="2160"/>
+            <w:tcW w:type="dxa" w:w="2493"/>
           </w:tcPr>
           <w:p>
+            <w:pPr>
+              <w:spacing w:before="160" w:after="160"/>
+              <w:ind w:firstLine="0"/>
+              <w:jc w:val="center"/>
+            </w:pPr>
             <w:r>
+              <w:rPr>
+                <w:rFonts w:ascii="Times New Roman" w:hAnsi="Times New Roman"/>
+                <w:sz w:val="24"/>
+              </w:rPr>
               <w:t>Qсут</w:t>
             </w:r>
           </w:p>
         </w:tc>
         <w:tc>
           <w:tcPr>
-            <w:tcW w:type="dxa" w:w="2160"/>
+            <w:tcW w:type="dxa" w:w="2493"/>
           </w:tcPr>
           <w:p>
+            <w:pPr>
+              <w:spacing w:before="160" w:after="160"/>
+              <w:ind w:firstLine="0"/>
+              <w:jc w:val="center"/>
+            </w:pPr>
             <w:r>
+              <w:rPr>
+                <w:rFonts w:ascii="Times New Roman" w:hAnsi="Times New Roman"/>
+                <w:sz w:val="24"/>
+              </w:rPr>
               <w:t>Среднесуточный расход воды</w:t>
             </w:r>
           </w:p>
         </w:tc>
         <w:tc>
           <w:tcPr>
-            <w:tcW w:type="dxa" w:w="2160"/>
+            <w:tcW w:type="dxa" w:w="2493"/>
           </w:tcPr>
           <w:p>
+            <w:pPr>
+              <w:spacing w:before="160" w:after="160"/>
+              <w:ind w:firstLine="0"/>
+              <w:jc w:val="center"/>
+            </w:pPr>
             <w:r>
+              <w:rPr>
+                <w:rFonts w:ascii="Times New Roman" w:hAnsi="Times New Roman"/>
+                <w:sz w:val="24"/>
+              </w:rPr>
               <w:t>3600</w:t>
             </w:r>
           </w:p>
         </w:tc>
         <w:tc>
           <w:tcPr>
-            <w:tcW w:type="dxa" w:w="2160"/>
+            <w:tcW w:type="dxa" w:w="2493"/>
           </w:tcPr>
           <w:p>
+            <w:pPr>
+              <w:spacing w:before="160" w:after="160"/>
+              <w:ind w:firstLine="0"/>
+              <w:jc w:val="center"/>
+            </w:pPr>
             <w:r>
+              <w:rPr>
+                <w:rFonts w:ascii="Times New Roman" w:hAnsi="Times New Roman"/>
+                <w:sz w:val="24"/>
+              </w:rPr>
               <w:t>м³/сут</w:t>
             </w:r>
           </w:p>
@@ -187,80 +318,153 @@
       <w:tr>
         <w:tc>
           <w:tcPr>
-            <w:tcW w:type="dxa" w:w="2160"/>
+            <w:tcW w:type="dxa" w:w="2493"/>
           </w:tcPr>
           <w:p>
+            <w:pPr>
+              <w:spacing w:before="160" w:after="160"/>
+              <w:ind w:firstLine="0"/>
+              <w:jc w:val="center"/>
+            </w:pPr>
             <w:r>
+              <w:rPr>
+                <w:rFonts w:ascii="Times New Roman" w:hAnsi="Times New Roman"/>
+                <w:sz w:val="24"/>
+              </w:rPr>
               <w:t>Kmax.ч</w:t>
             </w:r>
           </w:p>
         </w:tc>
         <w:tc>
           <w:tcPr>
-            <w:tcW w:type="dxa" w:w="2160"/>
+            <w:tcW w:type="dxa" w:w="2493"/>
           </w:tcPr>
           <w:p>
+            <w:pPr>
+              <w:spacing w:before="160" w:after="160"/>
+              <w:ind w:firstLine="0"/>
+              <w:jc w:val="center"/>
+            </w:pPr>
             <w:r>
+              <w:rPr>
+                <w:rFonts w:ascii="Times New Roman" w:hAnsi="Times New Roman"/>
+                <w:sz w:val="24"/>
+              </w:rPr>
               <w:t>Коэффициент максимальной часовой неравномерности</w:t>
             </w:r>
           </w:p>
         </w:tc>
         <w:tc>
           <w:tcPr>
-            <w:tcW w:type="dxa" w:w="2160"/>
+            <w:tcW w:type="dxa" w:w="2493"/>
           </w:tcPr>
           <w:p>
+            <w:pPr>
+              <w:spacing w:before="160" w:after="160"/>
+              <w:ind w:firstLine="0"/>
+              <w:jc w:val="center"/>
+            </w:pPr>
             <w:r>
+              <w:rPr>
+                <w:rFonts w:ascii="Times New Roman" w:hAnsi="Times New Roman"/>
+                <w:sz w:val="24"/>
+              </w:rPr>
               <w:t>1,7</w:t>
             </w:r>
           </w:p>
         </w:tc>
         <w:tc>
           <w:tcPr>
-            <w:tcW w:type="dxa" w:w="2160"/>
+            <w:tcW w:type="dxa" w:w="2493"/>
           </w:tcPr>
           <w:p>
-            <w:r/>
+            <w:pPr>
+              <w:spacing w:before="160" w:after="160"/>
+              <w:ind w:firstLine="0"/>
+              <w:jc w:val="center"/>
+            </w:pPr>
+            <w:r>
+              <w:rPr>
+                <w:rFonts w:ascii="Times New Roman" w:hAnsi="Times New Roman"/>
+                <w:sz w:val="24"/>
+              </w:rPr>
+            </w:r>
           </w:p>
         </w:tc>
       </w:tr>
       <w:tr>
         <w:tc>
           <w:tcPr>
-            <w:tcW w:type="dxa" w:w="2160"/>
+            <w:tcW w:type="dxa" w:w="2493"/>
           </w:tcPr>
           <w:p>
+            <w:pPr>
+              <w:spacing w:before="160" w:after="160"/>
+              <w:ind w:firstLine="0"/>
+              <w:jc w:val="center"/>
+            </w:pPr>
             <w:r>
+              <w:rPr>
+                <w:rFonts w:ascii="Times New Roman" w:hAnsi="Times New Roman"/>
+                <w:sz w:val="24"/>
+              </w:rPr>
               <w:t>vэк</w:t>
             </w:r>
           </w:p>
         </w:tc>
         <w:tc>
           <w:tcPr>
-            <w:tcW w:type="dxa" w:w="2160"/>
+            <w:tcW w:type="dxa" w:w="2493"/>
           </w:tcPr>
           <w:p>
+            <w:pPr>
+              <w:spacing w:before="160" w:after="160"/>
+              <w:ind w:firstLine="0"/>
+              <w:jc w:val="center"/>
+            </w:pPr>
             <w:r>
+              <w:rPr>
+                <w:rFonts w:ascii="Times New Roman" w:hAnsi="Times New Roman"/>
+                <w:sz w:val="24"/>
+              </w:rPr>
               <w:t>Экономическая скорость движения воды в трубах</w:t>
             </w:r>
           </w:p>
         </w:tc>
         <w:tc>
           <w:tcPr>
-            <w:tcW w:type="dxa" w:w="2160"/>
+            <w:tcW w:type="dxa" w:w="2493"/>
           </w:tcPr>
           <w:p>
+            <w:pPr>
+              <w:spacing w:before="160" w:after="160"/>
+              <w:ind w:firstLine="0"/>
+              <w:jc w:val="center"/>
+            </w:pPr>
             <w:r>
+              <w:rPr>
+                <w:rFonts w:ascii="Times New Roman" w:hAnsi="Times New Roman"/>
+                <w:sz w:val="24"/>
+              </w:rPr>
               <w:t>1</w:t>
             </w:r>
           </w:p>
         </w:tc>
         <w:tc>
           <w:tcPr>
-            <w:tcW w:type="dxa" w:w="2160"/>
+            <w:tcW w:type="dxa" w:w="2493"/>
           </w:tcPr>
           <w:p>
+            <w:pPr>
+              <w:spacing w:before="160" w:after="160"/>
+              <w:ind w:firstLine="0"/>
+              <w:jc w:val="center"/>
+            </w:pPr>
             <w:r>
+              <w:rPr>
+                <w:rFonts w:ascii="Times New Roman" w:hAnsi="Times New Roman"/>
+                <w:sz w:val="24"/>
+              </w:rPr>
               <w:t>м/с</w:t>
             </w:r>
           </w:p>
@@ -269,40 +473,76 @@
       <w:tr>
         <w:tc>
           <w:tcPr>
-            <w:tcW w:type="dxa" w:w="2160"/>
+            <w:tcW w:type="dxa" w:w="2493"/>
           </w:tcPr>
           <w:p>
+            <w:pPr>
+              <w:spacing w:before="160" w:after="160"/>
+              <w:ind w:firstLine="0"/>
+              <w:jc w:val="center"/>
+            </w:pPr>
             <w:r>
+              <w:rPr>
+                <w:rFonts w:ascii="Times New Roman" w:hAnsi="Times New Roman"/>
+                <w:sz w:val="24"/>
+              </w:rPr>
               <w:t>Hсв</w:t>
             </w:r>
           </w:p>
         </w:tc>
         <w:tc>
           <w:tcPr>
-            <w:tcW w:type="dxa" w:w="2160"/>
+            <w:tcW w:type="dxa" w:w="2493"/>
           </w:tcPr>
           <w:p>
+            <w:pPr>
+              <w:spacing w:before="160" w:after="160"/>
+              <w:ind w:firstLine="0"/>
+              <w:jc w:val="center"/>
+            </w:pPr>
             <w:r>
+              <w:rPr>
+                <w:rFonts w:ascii="Times New Roman" w:hAnsi="Times New Roman"/>
+                <w:sz w:val="24"/>
+              </w:rPr>
               <w:t>Свободный напор в распределительной сети</w:t>
             </w:r>
           </w:p>
         </w:tc>
         <w:tc>
           <w:tcPr>
-            <w:tcW w:type="dxa" w:w="2160"/>
+            <w:tcW w:type="dxa" w:w="2493"/>
           </w:tcPr>
           <w:p>
+            <w:pPr>
+              <w:spacing w:before="160" w:after="160"/>
+              <w:ind w:firstLine="0"/>
+              <w:jc w:val="center"/>
+            </w:pPr>
             <w:r>
+              <w:rPr>
+                <w:rFonts w:ascii="Times New Roman" w:hAnsi="Times New Roman"/>
+                <w:sz w:val="24"/>
+              </w:rPr>
               <w:t>10</w:t>
             </w:r>
           </w:p>
         </w:tc>
         <w:tc>
           <w:tcPr>
-            <w:tcW w:type="dxa" w:w="2160"/>
+            <w:tcW w:type="dxa" w:w="2493"/>
           </w:tcPr>
           <w:p>
+            <w:pPr>
+              <w:spacing w:before="160" w:after="160"/>
+              <w:ind w:firstLine="0"/>
+              <w:jc w:val="center"/>
+            </w:pPr>
             <w:r>
+              <w:rPr>
+                <w:rFonts w:ascii="Times New Roman" w:hAnsi="Times New Roman"/>
+                <w:sz w:val="24"/>
+              </w:rPr>
               <w:t>м</w:t>
             </w:r>
           </w:p>
@@ -311,40 +551,76 @@
       <w:tr>
         <w:tc>
           <w:tcPr>
-            <w:tcW w:type="dxa" w:w="2160"/>
+            <w:tcW w:type="dxa" w:w="2493"/>
           </w:tcPr>
           <w:p>
+            <w:pPr>
+              <w:spacing w:before="160" w:after="160"/>
+              <w:ind w:firstLine="0"/>
+              <w:jc w:val="center"/>
+            </w:pPr>
             <w:r>
+              <w:rPr>
+                <w:rFonts w:ascii="Times New Roman" w:hAnsi="Times New Roman"/>
+                <w:sz w:val="24"/>
+              </w:rPr>
               <w:t>l</w:t>
             </w:r>
           </w:p>
         </w:tc>
         <w:tc>
           <w:tcPr>
-            <w:tcW w:type="dxa" w:w="2160"/>
+            <w:tcW w:type="dxa" w:w="2493"/>
           </w:tcPr>
           <w:p>
+            <w:pPr>
+              <w:spacing w:before="160" w:after="160"/>
+              <w:ind w:firstLine="0"/>
+              <w:jc w:val="center"/>
+            </w:pPr>
             <w:r>
+              <w:rPr>
+                <w:rFonts w:ascii="Times New Roman" w:hAnsi="Times New Roman"/>
+                <w:sz w:val="24"/>
+              </w:rPr>
               <w:t>Длина расчётного участка трубопровода</w:t>
             </w:r>
           </w:p>
         </w:tc>
         <w:tc>
           <w:tcPr>
-            <w:tcW w:type="dxa" w:w="2160"/>
+            <w:tcW w:type="dxa" w:w="2493"/>
           </w:tcPr>
           <w:p>
+            <w:pPr>
+              <w:spacing w:before="160" w:after="160"/>
+              <w:ind w:firstLine="0"/>
+              <w:jc w:val="center"/>
+            </w:pPr>
             <w:r>
+              <w:rPr>
+                <w:rFonts w:ascii="Times New Roman" w:hAnsi="Times New Roman"/>
+                <w:sz w:val="24"/>
+              </w:rPr>
               <w:t>500</w:t>
             </w:r>
           </w:p>
         </w:tc>
         <w:tc>
           <w:tcPr>
-            <w:tcW w:type="dxa" w:w="2160"/>
+            <w:tcW w:type="dxa" w:w="2493"/>
           </w:tcPr>
           <w:p>
+            <w:pPr>
+              <w:spacing w:before="160" w:after="160"/>
+              <w:ind w:firstLine="0"/>
+              <w:jc w:val="center"/>
+            </w:pPr>
             <w:r>
+              <w:rPr>
+                <w:rFonts w:ascii="Times New Roman" w:hAnsi="Times New Roman"/>
+                <w:sz w:val="24"/>
+              </w:rPr>
               <w:t>м</w:t>
             </w:r>
           </w:p>
@@ -353,40 +629,76 @@
       <w:tr>
         <w:tc>
           <w:tcPr>
-            <w:tcW w:type="dxa" w:w="2160"/>
+            <w:tcW w:type="dxa" w:w="2493"/>
           </w:tcPr>
           <w:p>
+            <w:pPr>
+              <w:spacing w:before="160" w:after="160"/>
+              <w:ind w:firstLine="0"/>
+              <w:jc w:val="center"/>
+            </w:pPr>
             <w:r>
+              <w:rPr>
+                <w:rFonts w:ascii="Times New Roman" w:hAnsi="Times New Roman"/>
+                <w:sz w:val="24"/>
+              </w:rPr>
               <w:t>i</w:t>
             </w:r>
           </w:p>
         </w:tc>
         <w:tc>
           <w:tcPr>
-            <w:tcW w:type="dxa" w:w="2160"/>
+            <w:tcW w:type="dxa" w:w="2493"/>
           </w:tcPr>
           <w:p>
+            <w:pPr>
+              <w:spacing w:before="160" w:after="160"/>
+              <w:ind w:firstLine="0"/>
+              <w:jc w:val="center"/>
+            </w:pPr>
             <w:r>
+              <w:rPr>
+                <w:rFonts w:ascii="Times New Roman" w:hAnsi="Times New Roman"/>
+                <w:sz w:val="24"/>
+              </w:rPr>
               <w:t>Гидравлический уклон</w:t>
             </w:r>
           </w:p>
         </w:tc>
         <w:tc>
           <w:tcPr>
-            <w:tcW w:type="dxa" w:w="2160"/>
+            <w:tcW w:type="dxa" w:w="2493"/>
           </w:tcPr>
           <w:p>
+            <w:pPr>
+              <w:spacing w:before="160" w:after="160"/>
+              <w:ind w:firstLine="0"/>
+              <w:jc w:val="center"/>
+            </w:pPr>
             <w:r>
+              <w:rPr>
+                <w:rFonts w:ascii="Times New Roman" w:hAnsi="Times New Roman"/>
+                <w:sz w:val="24"/>
+              </w:rPr>
               <w:t>0,005</w:t>
             </w:r>
           </w:p>
         </w:tc>
         <w:tc>
           <w:tcPr>
-            <w:tcW w:type="dxa" w:w="2160"/>
+            <w:tcW w:type="dxa" w:w="2493"/>
           </w:tcPr>
           <w:p>
+            <w:pPr>
+              <w:spacing w:before="160" w:after="160"/>
+              <w:ind w:firstLine="0"/>
+              <w:jc w:val="center"/>
+            </w:pPr>
             <w:r>
+              <w:rPr>
+                <w:rFonts w:ascii="Times New Roman" w:hAnsi="Times New Roman"/>
+                <w:sz w:val="24"/>
+              </w:rPr>
               <w:t>м/м</w:t>
             </w:r>
           </w:p>
@@ -407,60 +719,103 @@
       </w:r>
     </w:p>
     <w:p>
+      <w:pPr>
+        <w:ind w:firstLine="0"/>
+      </w:pPr>
       <w:r>
         <w:t>Определение средних и максимальных расходов воды в системе водоснабжения.</w:t>
       </w:r>
     </w:p>
     <w:p>
+      <w:pPr>
+        <w:ind w:firstLine="0"/>
+      </w:pPr>
       <w:r>
-        <w:t>Средний часовой расход воды, Qч, определяется по формуле:</w:t>
+        <w:t>Средний часовой расход воды, Qч, рассчитывается по формуле:</w:t>
       </w:r>
     </w:p>
     <w:p>
       <w:pPr>
-        <w:jc w:val="center"/>
+        <w:ind w:firstLine="0"/>
+        <w:tabs>
+          <w:tab w:val="center" w:pos="4820"/>
+          <w:tab w:val="right" w:pos="9639"/>
+        </w:tabs>
       </w:pPr>
       <w:r>
-        <w:t>Qч = Q_sut / 24 = 150 м³/ч    (1)</w:t>
-      </w:r>
-    </w:p>
-    <w:p>
-      <w:r>
-        <w:t>Средний секундный расход воды, Qс, определяется по формуле:</w:t>
+        <w:tab/>
+        <w:t>Qч = Q_sut / 24 = 3600 / 24 = 150 м³/ч</w:t>
+        <w:tab/>
+        <w:t>(1)</w:t>
       </w:r>
     </w:p>
     <w:p>
       <w:pPr>
-        <w:jc w:val="center"/>
+        <w:ind w:firstLine="0"/>
       </w:pPr>
       <w:r>
-        <w:t>Qс = Q_sut * 1000 / 86400 = 41,667 л/с    (2)</w:t>
-      </w:r>
-    </w:p>
-    <w:p>
-      <w:r>
-        <w:t>Максимальный часовой расход воды, Qmax.ч, определяется по формуле:</w:t>
+        <w:t>Средний секундный расход воды, Qс, рассчитывается по формуле:</w:t>
       </w:r>
     </w:p>
     <w:p>
       <w:pPr>
-        <w:jc w:val="center"/>
+        <w:ind w:firstLine="0"/>
+        <w:tabs>
+          <w:tab w:val="center" w:pos="4820"/>
+          <w:tab w:val="right" w:pos="9639"/>
+        </w:tabs>
       </w:pPr>
       <w:r>
-        <w:t>Qmax.ч = Q_chas * K_max_ch = 255 м³/ч    (3)</w:t>
-      </w:r>
-    </w:p>
-    <w:p>
-      <w:r>
-        <w:t>Максимальный секундный расход воды, Qmax.с, определяется по формуле:</w:t>
+        <w:tab/>
+        <w:t>Qс = Q_sut * 1000 / 86400 = 3600 * 1000 / 86400 = 41,667 л/с</w:t>
+        <w:tab/>
+        <w:t>(2)</w:t>
       </w:r>
     </w:p>
     <w:p>
       <w:pPr>
-        <w:jc w:val="center"/>
+        <w:ind w:firstLine="0"/>
       </w:pPr>
       <w:r>
-        <w:t>Qmax.с = Q_max_chas * 1000 / 3600 = 70,833 л/с    (4)</w:t>
+        <w:t>Максимальный часовой расход воды, Qmax.ч, рассчитывается по формуле:</w:t>
+      </w:r>
+    </w:p>
+    <w:p>
+      <w:pPr>
+        <w:ind w:firstLine="0"/>
+        <w:tabs>
+          <w:tab w:val="center" w:pos="4820"/>
+          <w:tab w:val="right" w:pos="9639"/>
+        </w:tabs>
+      </w:pPr>
+      <w:r>
+        <w:tab/>
+        <w:t>Qmax.ч = Q_chas * K_max_ch = 150 * 1,7 = 255 м³/ч</w:t>
+        <w:tab/>
+        <w:t>(3)</w:t>
+      </w:r>
+    </w:p>
+    <w:p>
+      <w:pPr>
+        <w:ind w:firstLine="0"/>
+      </w:pPr>
+      <w:r>
+        <w:t>Максимальный секундный расход воды, Qmax.с, рассчитывается по формуле:</w:t>
+      </w:r>
+    </w:p>
+    <w:p>
+      <w:pPr>
+        <w:ind w:firstLine="0"/>
+        <w:tabs>
+          <w:tab w:val="center" w:pos="4820"/>
+          <w:tab w:val="right" w:pos="9639"/>
+        </w:tabs>
+      </w:pPr>
+      <w:r>
+        <w:tab/>
+        <w:t>Qmax.с = Q_max_chas * 1000 / 3600 = 255 * 1000 / 3600 = 70,833 л/с</w:t>
+        <w:tab/>
+        <w:t>(4)</w:t>
       </w:r>
     </w:p>
     <w:p>
@@ -472,65 +827,135 @@
       </w:r>
     </w:p>
     <w:p>
+      <w:pPr>
+        <w:ind w:firstLine="0"/>
+      </w:pPr>
       <w:r>
         <w:t>Подбор диаметра трубопровода и определение требуемого напора.</w:t>
       </w:r>
     </w:p>
     <w:p>
+      <w:pPr>
+        <w:ind w:firstLine="0"/>
+      </w:pPr>
       <w:r>
-        <w:t>Расчётный диаметр трубопровода, Dрасч, определяется по формуле:</w:t>
+        <w:t>Расчётный диаметр трубопровода, Dрасч, рассчитывается по формуле:</w:t>
       </w:r>
     </w:p>
     <w:p>
       <w:pPr>
-        <w:jc w:val="center"/>
+        <w:ind w:firstLine="0"/>
+        <w:tabs>
+          <w:tab w:val="center" w:pos="4820"/>
+          <w:tab w:val="right" w:pos="9639"/>
+        </w:tabs>
       </w:pPr>
       <w:r>
-        <w:t>Dрасч = sqrt(4 * Q_max_sek / (1000 * pi * v_ek)) = 0,3003 м    (5)</w:t>
+        <w:tab/>
+        <w:t>Dрасч = sqrt(4 * Q_max_sek / (1000 * pi * v_ek)) = sqrt(4 * 70,8333 / (1000 * pi * 1)) = 0,3003 м</w:t>
+        <w:tab/>
+        <w:t>(5)</w:t>
+      </w:r>
+    </w:p>
+    <w:p>
+      <w:pPr>
+        <w:ind w:firstLine="0"/>
+      </w:pPr>
+      <w:r>
+        <w:t>где Диаметр определяется из условия обеспечения экономической скорости. Q переведён из л/с в м³/с делением на 1000.</w:t>
+      </w:r>
+    </w:p>
+    <w:p>
+      <w:pPr>
+        <w:ind w:firstLine="0"/>
+      </w:pPr>
+      <w:r>
+        <w:t>Диаметр трубопровода, D, рассчитывается по формуле:</w:t>
+      </w:r>
+    </w:p>
+    <w:p>
+      <w:pPr>
+        <w:ind w:firstLine="0"/>
+        <w:tabs>
+          <w:tab w:val="center" w:pos="4820"/>
+          <w:tab w:val="right" w:pos="9639"/>
+        </w:tabs>
+      </w:pPr>
+      <w:r>
+        <w:tab/>
+        <w:t>D = D_raschet * 1000 = 0,3 * 1000 = 300,3 мм</w:t>
+        <w:tab/>
+        <w:t>(6)</w:t>
+      </w:r>
+    </w:p>
+    <w:p>
+      <w:pPr>
+        <w:ind w:firstLine="0"/>
+      </w:pPr>
+      <w:r>
+        <w:t>Потери напора на расчётном участке, h, рассчитывается по формуле:</w:t>
+      </w:r>
+    </w:p>
+    <w:p>
+      <w:pPr>
+        <w:ind w:firstLine="0"/>
+        <w:tabs>
+          <w:tab w:val="center" w:pos="4820"/>
+          <w:tab w:val="right" w:pos="9639"/>
+        </w:tabs>
+      </w:pPr>
+      <w:r>
+        <w:tab/>
+        <w:t>h = i_hydr * l_pipe = 0,005 * 500 = 2,5 м</w:t>
+        <w:tab/>
+        <w:t>(7)</w:t>
+      </w:r>
+    </w:p>
+    <w:p>
+      <w:pPr>
+        <w:ind w:firstLine="0"/>
+      </w:pPr>
+      <w:r>
+        <w:t>Требуемый напор насосной станции, Hнас, рассчитывается по формуле:</w:t>
+      </w:r>
+    </w:p>
+    <w:p>
+      <w:pPr>
+        <w:ind w:firstLine="0"/>
+        <w:tabs>
+          <w:tab w:val="center" w:pos="4820"/>
+          <w:tab w:val="right" w:pos="9639"/>
+        </w:tabs>
+      </w:pPr>
+      <w:r>
+        <w:tab/>
+        <w:t>Hнас = h_poteri + H_sv = 2,5 + 10 = 12,5 м</w:t>
+        <w:tab/>
+        <w:t>(8)</w:t>
       </w:r>
     </w:p>
     <w:p>
       <w:r>
-        <w:t>Диаметр определяется из условия обеспечения экономической скорости. Q переведён из л/с в м³/с делением на 1000.</w:t>
-      </w:r>
-    </w:p>
-    <w:p>
-      <w:r>
-        <w:t>Диаметр трубопровода, D, определяется по формуле:</w:t>
+        <w:br w:type="page"/>
       </w:r>
     </w:p>
     <w:p>
       <w:pPr>
-        <w:jc w:val="center"/>
+        <w:pStyle w:val="Heading1"/>
       </w:pPr>
       <w:r>
-        <w:t>D = D_raschet * 1000 = 300,3 мм    (6)</w:t>
-      </w:r>
-    </w:p>
-    <w:p>
-      <w:r>
-        <w:t>Потери напора на расчётном участке, h, определяется по формуле:</w:t>
+        <w:t>Графическая часть</w:t>
       </w:r>
     </w:p>
     <w:p>
       <w:pPr>
-        <w:jc w:val="center"/>
+        <w:ind w:firstLine="0"/>
       </w:pPr>
       <w:r>
-        <w:t>h = i_hydr * l_pipe = 2,5 м    (7)</w:t>
-      </w:r>
-    </w:p>
-    <w:p>
-      <w:r>
-        <w:t>Требуемый напор насосной станции, Hнас, определяется по формуле:</w:t>
-      </w:r>
-    </w:p>
-    <w:p>
-      <w:pPr>
-        <w:jc w:val="center"/>
-      </w:pPr>
-      <w:r>
-        <w:t>Hнас = h_poteri + H_sv = 12,5 м    (8)</w:t>
+        <w:rPr>
+          <w:i/>
+        </w:rPr>
+        <w:t>[Графическая часть формируется отдельно — блок-схема и генплан не входят в автоматический расчёт]</w:t>
       </w:r>
     </w:p>
     <w:p>
@@ -546,9 +971,41 @@
         <w:t>В результате выполненного расчёта системы водоснабжения малого посёлка определены расчётные расходы воды: средний секундный расход составляет 41.667 л/с, максимальный секундный — 70.833 л/с. Расчётный диаметр трубопровода составляет 0.3003 м (300.3 мм). Потери напора на участке длиной 500 м — 2.500 м, требуемый напор насосной станции — 12.50 м. Скоростной режим соответствует нормативным требованиям СП 31.13330.</w:t>
       </w:r>
     </w:p>
+    <w:p>
+      <w:pPr>
+        <w:pStyle w:val="Heading1"/>
+      </w:pPr>
+      <w:r>
+        <w:t>Список использованных источников</w:t>
+      </w:r>
+    </w:p>
+    <w:p>
+      <w:pPr>
+        <w:ind w:firstLine="0" w:left="709"/>
+      </w:pPr>
+      <w:r>
+        <w:t>1. СП 31.13330.2021. Водоснабжение. Наружные сети и сооружения. М.: Минстрой России, 2021.</w:t>
+      </w:r>
+    </w:p>
+    <w:p>
+      <w:pPr>
+        <w:ind w:firstLine="0" w:left="709"/>
+      </w:pPr>
+      <w:r>
+        <w:t>2. Абрамов Н.Н. Водоснабжение. — М.: Стройиздат, 1982. — 440 с.</w:t>
+      </w:r>
+    </w:p>
+    <w:p>
+      <w:pPr>
+        <w:ind w:firstLine="0" w:left="709"/>
+      </w:pPr>
+      <w:r>
+        <w:t>3. Шевелев Ф.А., Шевелев А.Ф. Таблицы для гидравлического расчёта водопроводных труб. — М.: Стройиздат, 1984. — 116 с.</w:t>
+      </w:r>
+    </w:p>
     <w:sectPr>
       <w:pgSz w:w="12240" w:h="15840"/>
-      <w:pgMar w:top="1440" w:right="1800" w:bottom="1440" w:left="1800" w:header="720" w:footer="720" w:gutter="0"/>
+      <w:pgMar w:top="1134" w:right="567" w:bottom="1134" w:left="1701" w:header="720" w:footer="720" w:gutter="0"/>
       <w:cols w:space="720"/>
       <w:docGrid w:linePitch="360"/>
     </w:sectPr>
@@ -919,6 +1376,15 @@
     <w:name w:val="Normal"/>
     <w:qFormat/>
     <w:rsid w:val="00FC693F"/>
+    <w:pPr>
+      <w:spacing w:line="360" w:lineRule="auto" w:before="0" w:after="0"/>
+      <w:ind w:firstLine="709"/>
+      <w:jc w:val="both"/>
+    </w:pPr>
+    <w:rPr>
+      <w:rFonts w:ascii="Times New Roman" w:hAnsi="Times New Roman" w:eastAsia="Times New Roman" w:cs="Times New Roman"/>
+      <w:sz w:val="28"/>
+    </w:rPr>
   </w:style>
   <w:style w:type="paragraph" w:styleId="Header">
     <w:name w:val="header"/>
@@ -975,14 +1441,18 @@
     <w:pPr>
       <w:keepNext/>
       <w:keepLines/>
-      <w:spacing w:before="480" w:after="0"/>
+      <w:pageBreakBefore w:val="0"/>
+      <w:spacing w:before="280" w:after="280" w:line="360" w:lineRule="auto"/>
+      <w:ind w:left="709"/>
+      <w:jc w:val="both"/>
       <w:outlineLvl w:val="0"/>
     </w:pPr>
     <w:rPr>
-      <w:rFonts w:asciiTheme="majorHAnsi" w:eastAsiaTheme="majorEastAsia" w:hAnsiTheme="majorHAnsi" w:cstheme="majorBidi"/>
+      <w:rFonts w:asciiTheme="majorHAnsi" w:eastAsiaTheme="majorEastAsia" w:hAnsiTheme="majorHAnsi" w:cstheme="majorBidi" w:ascii="Times New Roman" w:hAnsi="Times New Roman" w:eastAsia="Times New Roman" w:cs="Times New Roman"/>
       <w:b/>
       <w:bCs/>
-      <w:color w:val="365F91" w:themeColor="accent1" w:themeShade="BF"/>
+      <w:i w:val="0"/>
+      <w:color w:val="000000"/>
       <w:sz w:val="28"/>
       <w:szCs w:val="28"/>
     </w:rPr>
@@ -999,15 +1469,19 @@
     <w:pPr>
       <w:keepNext/>
       <w:keepLines/>
-      <w:spacing w:before="200" w:after="0"/>
+      <w:pageBreakBefore w:val="0"/>
+      <w:spacing w:before="280" w:after="280" w:line="360" w:lineRule="auto"/>
+      <w:ind w:left="709"/>
+      <w:jc w:val="both"/>
       <w:outlineLvl w:val="1"/>
     </w:pPr>
     <w:rPr>
-      <w:rFonts w:asciiTheme="majorHAnsi" w:eastAsiaTheme="majorEastAsia" w:hAnsiTheme="majorHAnsi" w:cstheme="majorBidi"/>
+      <w:rFonts w:asciiTheme="majorHAnsi" w:eastAsiaTheme="majorEastAsia" w:hAnsiTheme="majorHAnsi" w:cstheme="majorBidi" w:ascii="Times New Roman" w:hAnsi="Times New Roman" w:eastAsia="Times New Roman" w:cs="Times New Roman"/>
       <w:b/>
       <w:bCs/>
-      <w:color w:val="4F81BD" w:themeColor="accent1"/>
-      <w:sz w:val="26"/>
+      <w:i w:val="0"/>
+      <w:color w:val="000000"/>
+      <w:sz w:val="28"/>
       <w:szCs w:val="26"/>
     </w:rPr>
   </w:style>

</xml_diff>